<commit_message>
feat: complete 5-level course breakdown with interactive materials, clean presentation UI, and updated official links
</commit_message>
<xml_diff>
--- a/Documento_Entrega_y_Sustentacion_InvestigaLab.docx
+++ b/Documento_Entrega_y_Sustentacion_InvestigaLab.docx
@@ -4,18 +4,11 @@
   <w:body>
     <w:p>
       <w:pPr>
+        <w:pStyle w:val="Title"/>
         <w:jc w:val="center"/>
       </w:pPr>
       <w:r>
-        <w:rPr>
-          <w:b/>
-          <w:color w:val="6B7280"/>
-          <w:sz w:val="24"/>
-        </w:rPr>
-        <w:t>UNIVERSIDAD UFHEC</w:t>
-        <w:br/>
-        <w:t>MAESTRÍA EN INTELIGENCIA ARTIFICIAL Y PROGRAMACIÓN EN EDUCACIÓN</w:t>
-        <w:br/>
+        <w:t>InvestigaLab: Curso &amp; Plataforma de Metodología de la Investigación Científica</w:t>
       </w:r>
     </w:p>
     <w:p>
@@ -25,85 +18,50 @@
       <w:r>
         <w:rPr>
           <w:b/>
-          <w:color w:val="4F46E5"/>
-          <w:sz w:val="40"/>
         </w:rPr>
-        <w:t>INFORME FINAL Y GUÍA DE SUSTENTACIÓN</w:t>
+        <w:t>Maestría en Inteligencia Artificial y Educación | Programación en Educación</w:t>
         <w:br/>
-        <w:t>INVESTIGALAB: ESCUELA DE METODOLOGÍA CIENTÍFICA</w:t>
       </w:r>
-    </w:p>
-    <w:p>
-      <w:pPr>
-        <w:jc w:val="center"/>
-      </w:pPr>
       <w:r>
-        <w:rPr>
-          <w:i/>
-          <w:sz w:val="22"/>
-        </w:rPr>
-        <w:t>Desarrollo de una Aplicación Web en Python con Flask, Despliegue en Render y Arquitectura Archify</w:t>
+        <w:t>Plataforma Web en Python / Flask &amp; Cuaderno Interactivo</w:t>
         <w:br/>
       </w:r>
     </w:p>
     <w:p>
       <w:pPr>
-        <w:jc w:val="center"/>
+        <w:pStyle w:val="Heading1"/>
       </w:pPr>
       <w:r>
-        <w:t>─────────────────────────────────────────────</w:t>
-      </w:r>
-    </w:p>
-    <w:p>
-      <w:pPr>
-        <w:pStyle w:val="Heading1"/>
-        <w:spacing w:before="280" w:after="120"/>
-      </w:pPr>
-      <w:r>
-        <w:rPr>
-          <w:b/>
-          <w:color w:val="4F46E5"/>
-          <w:sz w:val="32"/>
-        </w:rPr>
-        <w:t>1. Ficha Técnica y Enlaces Oficiales de Entrega</w:t>
+        <w:t>1. Enlaces Oficiales del Proyecto</w:t>
       </w:r>
     </w:p>
     <w:tbl>
       <w:tblPr>
         <w:tblW w:type="auto" w:w="0"/>
-        <w:jc w:val="center"/>
-        <w:tblLayout w:type="fixed"/>
         <w:tblLook w:firstColumn="1" w:firstRow="1" w:lastColumn="0" w:lastRow="0" w:noHBand="0" w:noVBand="1" w:val="04A0"/>
       </w:tblPr>
       <w:tblGrid>
-        <w:gridCol w:w="4680"/>
-        <w:gridCol w:w="4680"/>
+        <w:gridCol w:w="4320"/>
+        <w:gridCol w:w="4320"/>
       </w:tblGrid>
       <w:tr>
         <w:tc>
           <w:tcPr>
-            <w:tcW w:type="dxa" w:w="4680"/>
+            <w:tcW w:type="dxa" w:w="4320"/>
           </w:tcPr>
           <w:p>
             <w:r>
-              <w:rPr>
-                <w:b/>
-                <w:sz w:val="20"/>
-              </w:rPr>
-              <w:t>Proyecto / Aplicación:</w:t>
+              <w:t>Recurso / Entregable</w:t>
             </w:r>
           </w:p>
         </w:tc>
         <w:tc>
           <w:tcPr>
-            <w:tcW w:type="dxa" w:w="4680"/>
+            <w:tcW w:type="dxa" w:w="4320"/>
           </w:tcPr>
           <w:p>
             <w:r>
-              <w:rPr>
-                <w:sz w:val="20"/>
-              </w:rPr>
-              <w:t>InvestigaLab - Metodología de la Investigación Científica</w:t>
+              <w:t>Enlace Oficial</w:t>
             </w:r>
           </w:p>
         </w:tc>
@@ -111,29 +69,20 @@
       <w:tr>
         <w:tc>
           <w:tcPr>
-            <w:tcW w:type="dxa" w:w="4680"/>
+            <w:tcW w:type="dxa" w:w="4320"/>
           </w:tcPr>
           <w:p>
             <w:r>
-              <w:rPr>
-                <w:b/>
-                <w:sz w:val="20"/>
-              </w:rPr>
-              <w:t>Despliegue Funcional en Vivo:</w:t>
+              <w:t>Despliegue en Vivo (Render)</w:t>
             </w:r>
           </w:p>
         </w:tc>
         <w:tc>
           <w:tcPr>
-            <w:tcW w:type="dxa" w:w="4680"/>
+            <w:tcW w:type="dxa" w:w="4320"/>
           </w:tcPr>
           <w:p>
             <w:r>
-              <w:rPr>
-                <w:color w:val="4F46E5"/>
-                <w:sz w:val="20"/>
-                <w:u w:val="single"/>
-              </w:rPr>
               <w:t>https://investigalab-python.onrender.com</w:t>
             </w:r>
           </w:p>
@@ -142,29 +91,20 @@
       <w:tr>
         <w:tc>
           <w:tcPr>
-            <w:tcW w:type="dxa" w:w="4680"/>
+            <w:tcW w:type="dxa" w:w="4320"/>
           </w:tcPr>
           <w:p>
             <w:r>
-              <w:rPr>
-                <w:b/>
-                <w:sz w:val="20"/>
-              </w:rPr>
-              <w:t>Repositorio Oficial GitHub:</w:t>
+              <w:t>Repositorio Oficial (GitHub)</w:t>
             </w:r>
           </w:p>
         </w:tc>
         <w:tc>
           <w:tcPr>
-            <w:tcW w:type="dxa" w:w="4680"/>
+            <w:tcW w:type="dxa" w:w="4320"/>
           </w:tcPr>
           <w:p>
             <w:r>
-              <w:rPr>
-                <w:color w:val="4F46E5"/>
-                <w:sz w:val="20"/>
-                <w:u w:val="single"/>
-              </w:rPr>
               <w:t>https://github.com/domingamaestriaufhec/Final-Python</w:t>
             </w:r>
           </w:p>
@@ -173,27 +113,64 @@
       <w:tr>
         <w:tc>
           <w:tcPr>
-            <w:tcW w:type="dxa" w:w="4680"/>
+            <w:tcW w:type="dxa" w:w="4320"/>
           </w:tcPr>
           <w:p>
             <w:r>
-              <w:rPr>
-                <w:b/>
-                <w:sz w:val="20"/>
-              </w:rPr>
-              <w:t>Cuaderno de Modelos Python:</w:t>
+              <w:t>Aplicación Estática (GitHub Pages)</w:t>
             </w:r>
           </w:p>
         </w:tc>
         <w:tc>
           <w:tcPr>
-            <w:tcW w:type="dxa" w:w="4680"/>
+            <w:tcW w:type="dxa" w:w="4320"/>
           </w:tcPr>
           <w:p>
             <w:r>
-              <w:rPr>
-                <w:sz w:val="20"/>
-              </w:rPr>
+              <w:t>https://domingamaestriaufhec.github.io/Final-Python/</w:t>
+            </w:r>
+          </w:p>
+        </w:tc>
+      </w:tr>
+      <w:tr>
+        <w:tc>
+          <w:tcPr>
+            <w:tcW w:type="dxa" w:w="4320"/>
+          </w:tcPr>
+          <w:p>
+            <w:r>
+              <w:t>Guión de Sustentación para Video</w:t>
+            </w:r>
+          </w:p>
+        </w:tc>
+        <w:tc>
+          <w:tcPr>
+            <w:tcW w:type="dxa" w:w="4320"/>
+          </w:tcPr>
+          <w:p>
+            <w:r>
+              <w:t>docs/presentacion_sustentacion.md</w:t>
+            </w:r>
+          </w:p>
+        </w:tc>
+      </w:tr>
+      <w:tr>
+        <w:tc>
+          <w:tcPr>
+            <w:tcW w:type="dxa" w:w="4320"/>
+          </w:tcPr>
+          <w:p>
+            <w:r>
+              <w:t>Cuaderno Jupyter con Modelos</w:t>
+            </w:r>
+          </w:p>
+        </w:tc>
+        <w:tc>
+          <w:tcPr>
+            <w:tcW w:type="dxa" w:w="4320"/>
+          </w:tcPr>
+          <w:p>
+            <w:r>
               <w:t>InvestigaLab_Metodologia_Cientifica.ipynb</w:t>
             </w:r>
           </w:p>
@@ -202,28 +179,21 @@
       <w:tr>
         <w:tc>
           <w:tcPr>
-            <w:tcW w:type="dxa" w:w="4680"/>
+            <w:tcW w:type="dxa" w:w="4320"/>
           </w:tcPr>
           <w:p>
             <w:r>
-              <w:rPr>
-                <w:b/>
-                <w:sz w:val="20"/>
-              </w:rPr>
-              <w:t>Framework y Lenguaje:</w:t>
+              <w:t>Tutorial Paso a Paso</w:t>
             </w:r>
           </w:p>
         </w:tc>
         <w:tc>
           <w:tcPr>
-            <w:tcW w:type="dxa" w:w="4680"/>
+            <w:tcW w:type="dxa" w:w="4320"/>
           </w:tcPr>
           <w:p>
             <w:r>
-              <w:rPr>
-                <w:sz w:val="20"/>
-              </w:rPr>
-              <w:t>Python 3.10+ | Flask 3.0.3 | WSGI Gunicorn</w:t>
+              <w:t>docs/tutorial.md</w:t>
             </w:r>
           </w:p>
         </w:tc>
@@ -231,28 +201,21 @@
       <w:tr>
         <w:tc>
           <w:tcPr>
-            <w:tcW w:type="dxa" w:w="4680"/>
+            <w:tcW w:type="dxa" w:w="4320"/>
           </w:tcPr>
           <w:p>
             <w:r>
-              <w:rPr>
-                <w:b/>
-                <w:sz w:val="20"/>
-              </w:rPr>
-              <w:t>Entorno de Desarrollo:</w:t>
+              <w:t>Evidencia de Google Antigravity</w:t>
             </w:r>
           </w:p>
         </w:tc>
         <w:tc>
           <w:tcPr>
-            <w:tcW w:type="dxa" w:w="4680"/>
+            <w:tcW w:type="dxa" w:w="4320"/>
           </w:tcPr>
           <w:p>
             <w:r>
-              <w:rPr>
-                <w:sz w:val="20"/>
-              </w:rPr>
-              <w:t>Google Antigravity IDE (Entorno Agéntico Avanzado)</w:t>
+              <w:t>docs/evidencia_antigravity.md</w:t>
             </w:r>
           </w:p>
         </w:tc>
@@ -260,455 +223,83 @@
     </w:tbl>
     <w:p>
       <w:pPr>
-        <w:spacing w:after="240"/>
-      </w:pPr>
-    </w:p>
-    <w:p>
-      <w:pPr>
         <w:pStyle w:val="Heading1"/>
-        <w:spacing w:before="280" w:after="120"/>
       </w:pPr>
       <w:r>
-        <w:rPr>
-          <w:b/>
-          <w:color w:val="4F46E5"/>
-          <w:sz w:val="32"/>
-        </w:rPr>
-        <w:t>2. Guión Oficial para el Video de Sustentación (5 a 7 Minutos)</w:t>
-      </w:r>
-    </w:p>
-    <w:p>
-      <w:r>
-        <w:t>Este guión está estructurado de manera secuencial para que el estudiante grabe su pantalla y voz demostrando el dominio teórico, metodológico y técnico del proyecto.</w:t>
-      </w:r>
-    </w:p>
-    <w:p>
-      <w:pPr>
-        <w:pStyle w:val="Heading2"/>
-        <w:spacing w:before="280" w:after="120"/>
-      </w:pPr>
-      <w:r>
-        <w:rPr>
-          <w:b/>
-          <w:color w:val="06B6D4"/>
-          <w:sz w:val="26"/>
-        </w:rPr>
-        <w:t>Minuto 0:00 - 0:45 | Portada y Presentación</w:t>
+        <w:t>2. Estructura Curricular en 5 Niveles</w:t>
       </w:r>
     </w:p>
     <w:p>
       <w:r>
         <w:rPr>
-          <w:i/>
-          <w:sz w:val="20"/>
+          <w:b/>
         </w:rPr>
-        <w:t>«Saludos cordiales, estimados profesores y evaluadores. Mi nombre es [Tu Nombre], estudiante de la Maestría en Inteligencia Artificial y Programación en Educación de la Universidad UFHEC. Presento la sustentación de nuestro proyecto final: InvestigaLab, una plataforma web y escuela interactiva para la enseñanza rigurosa de la Metodología de la Investigación Científica, desarrollada en Python con Flask y desplegada en producción en la nube.»</w:t>
+        <w:t xml:space="preserve">• Nivel 1: Principiante: </w:t>
       </w:r>
-    </w:p>
-    <w:p>
-      <w:pPr>
-        <w:pStyle w:val="Heading2"/>
-        <w:spacing w:before="280" w:after="120"/>
-      </w:pPr>
       <w:r>
-        <w:rPr>
-          <w:b/>
-          <w:color w:val="06B6D4"/>
-          <w:sz w:val="26"/>
-        </w:rPr>
-        <w:t>Minuto 0:45 - 1:45 | El Problema o Necesidad Abordada</w:t>
+        <w:t>Fundamentos Epistemológicos (Karl Popper, Mario Bunge) y delimitación del problema con Sampieri.</w:t>
       </w:r>
     </w:p>
     <w:p>
       <w:r>
         <w:rPr>
-          <w:i/>
-          <w:sz w:val="20"/>
+          <w:b/>
         </w:rPr>
-        <w:t>«En la formación universitaria y de posgrado, la metodología científica suele percibirse como una materia abstracta, densa e intimidante. Los estudiantes enfrentan bloqueos comunes: falta de congruencia entre objetivos e hipótesis, desconocimiento de fórmulas de muestreo representativo, confusión al seleccionar pruebas estadísticas (paramétricas vs no paramétricas) y dificultades para redactar artículos en formato IMRyD para revistas indexadas. Se requería una solución tecnológica viva, guiada y accesible.»</w:t>
+        <w:t xml:space="preserve">• Nivel 2: Básico: </w:t>
       </w:r>
-    </w:p>
-    <w:p>
-      <w:pPr>
-        <w:pStyle w:val="Heading2"/>
-        <w:spacing w:before="280" w:after="120"/>
-      </w:pPr>
       <w:r>
-        <w:rPr>
-          <w:b/>
-          <w:color w:val="06B6D4"/>
-          <w:sz w:val="26"/>
-        </w:rPr>
-        <w:t>Minuto 1:45 - 2:45 | La Solución Desarrollada: InvestigaLab</w:t>
+        <w:t>Búsqueda bibliográfica con operadores booleanos, marco teórico en embudo, objetivos SMART e hipótesis (H0/H1).</w:t>
       </w:r>
     </w:p>
     <w:p>
       <w:r>
         <w:rPr>
-          <w:i/>
-          <w:sz w:val="20"/>
+          <w:b/>
         </w:rPr>
-        <w:t>«Para resolver esta necesidad creamos InvestigaLab, estructurado en 5 niveles progresivos: Principiante, Básico, Intermedio, Avanzado y Experto. Todo el contenido está rigurosamente fundamentado en obras canónicas de la ciencia: el falsacionismo de Karl Popper, la epistemología de Mario Bunge, las rutas de Roberto Hernández-Sampieri, el principio MAXMINCON de Fred Kerlinger y los diseños mixtos de John Creswell.»</w:t>
+        <w:t xml:space="preserve">• Nivel 3: Intermedio: </w:t>
       </w:r>
-    </w:p>
-    <w:p>
-      <w:pPr>
-        <w:pStyle w:val="Heading2"/>
-        <w:spacing w:before="280" w:after="120"/>
-      </w:pPr>
       <w:r>
-        <w:rPr>
-          <w:b/>
-          <w:color w:val="06B6D4"/>
-          <w:sz w:val="26"/>
-        </w:rPr>
-        <w:t>Minuto 2:45 - 3:30 | Framework Seleccionado (Flask) y Justificación</w:t>
+        <w:t>Diseño metodológico, principio MAXMINCON de Fred Kerlinger, cálculo muestral y operacionalización de variables.</w:t>
       </w:r>
     </w:p>
     <w:p>
       <w:r>
         <w:rPr>
-          <w:i/>
-          <w:sz w:val="20"/>
+          <w:b/>
         </w:rPr>
-        <w:t>«Utilizamos Python como lenguaje base y Flask como framework web. Elegimos Flask por su patrón Application Factory (create_app), que permite una arquitectura limpia (Clean Architecture) y el desacoplamiento total entre la infraestructura técnica y la capa de dominio científico (app/data/). Esto asegura que el sistema sea modular, ligero para entornos educativos, extensible mediante Blueprints y altamente reproducible con entornos virtuales .venv y servidores WSGI como Gunicorn.»</w:t>
+        <w:t xml:space="preserve">• Nivel 4: Avanzado: </w:t>
       </w:r>
-    </w:p>
-    <w:p>
-      <w:pPr>
-        <w:pStyle w:val="Heading2"/>
-        <w:spacing w:before="280" w:after="120"/>
-      </w:pPr>
       <w:r>
-        <w:rPr>
-          <w:b/>
-          <w:color w:val="06B6D4"/>
-          <w:sz w:val="26"/>
-        </w:rPr>
-        <w:t>Minuto 3:30 - 4:30 | Principales Funcionalidades</w:t>
+        <w:t>Instrumentación psicométrica (Alfa de Cronbach, V de Aiken), normalidad y tamaño del efecto (d de Cohen).</w:t>
       </w:r>
     </w:p>
     <w:p>
       <w:r>
         <w:rPr>
-          <w:i/>
-          <w:sz w:val="20"/>
+          <w:b/>
         </w:rPr>
-        <w:t>«Las funcionalidades destacadas de InvestigaLab son: 1) Currículo de 5 Niveles con Autoevaluación Interactiva y fórmulas matemáticas; 2) Biblioteca de Libros y Autores Clásicos con capítulos recomendados; 3) Generador de Matriz de Consistencia Metodológica Viva con exportación a Markdown; y 4) Pipeline de Arquitectura Archify para documentar el flujo de datos de software y entregables de investigación.»</w:t>
+        <w:t xml:space="preserve">• Nivel 5: Experto: </w:t>
       </w:r>
-    </w:p>
-    <w:p>
-      <w:pPr>
-        <w:pStyle w:val="Heading2"/>
-        <w:spacing w:before="280" w:after="120"/>
-      </w:pPr>
       <w:r>
-        <w:rPr>
-          <w:b/>
-          <w:color w:val="06B6D4"/>
-          <w:sz w:val="26"/>
-        </w:rPr>
-        <w:t>Minuto 4:30 - 6:00 | Demostración en Vivo del Funcionamiento</w:t>
-      </w:r>
-    </w:p>
-    <w:p>
-      <w:r>
-        <w:rPr>
-          <w:i/>
-          <w:sz w:val="20"/>
-        </w:rPr>
-        <w:t>«(Muestra en pantalla el navegador con https://investigalab-python.onrender.com). Demostramos la Landing page con gráficos vectoriales, navegamos por los 5 niveles resolviendo un quiz interactivo, cargamos un ejemplo académico en la Matriz Científica y mostramos la pestaña del Pipeline Archify.»</w:t>
-      </w:r>
-    </w:p>
-    <w:p>
-      <w:pPr>
-        <w:pStyle w:val="Heading2"/>
-        <w:spacing w:before="280" w:after="120"/>
-      </w:pPr>
-      <w:r>
-        <w:rPr>
-          <w:b/>
-          <w:color w:val="06B6D4"/>
-          <w:sz w:val="26"/>
-        </w:rPr>
-        <w:t>Minuto 6:00 - 7:00 | Repositorio, Despliegue y Conclusión</w:t>
-      </w:r>
-    </w:p>
-    <w:p>
-      <w:r>
-        <w:rPr>
-          <w:i/>
-          <w:sz w:val="20"/>
-        </w:rPr>
-        <w:t>«El código se encuentra publicado y versionado en GitHub (domingamaestriaufhec/Final-Python), cuenta con un cuaderno Jupyter (InvestigaLab_Metodologia_Cientifica.ipynb) para la simulación estadística en Python, y manuales de arquitectura en docs/documentacion/. Todo el proceso fue desarrollado en el entorno agéntico de Google Antigravity. La aplicación se encuentra 100% activa en Render. Muchas gracias.»</w:t>
+        <w:t>Formato IMRyD, bioética (Belmont/Helsinki), directrices COPE sobre IA, revistas Q1-Q4 y cartas de réplica (Rebuttal).</w:t>
       </w:r>
     </w:p>
     <w:p>
       <w:pPr>
         <w:pStyle w:val="Heading1"/>
-        <w:spacing w:before="280" w:after="120"/>
       </w:pPr>
       <w:r>
-        <w:rPr>
-          <w:b/>
-          <w:color w:val="4F46E5"/>
-          <w:sz w:val="32"/>
-        </w:rPr>
-        <w:t>3. Explicación Técnica y Metodológica Paso a Paso</w:t>
+        <w:t>3. Herramientas Interactivas y Materiales</w:t>
       </w:r>
     </w:p>
     <w:p>
-      <w:pPr>
-        <w:pStyle w:val="Heading2"/>
-        <w:spacing w:before="280" w:after="120"/>
-      </w:pPr>
       <w:r>
-        <w:rPr>
-          <w:b/>
-          <w:color w:val="06B6D4"/>
-          <w:sz w:val="26"/>
-        </w:rPr>
-        <w:t>Paso 1: Concepción y Separación Conceptual (Idea vs. Técnica)</w:t>
-      </w:r>
-    </w:p>
-    <w:p>
-      <w:pPr>
-        <w:spacing w:after="120"/>
-      </w:pPr>
-      <w:r>
-        <w:t>Se definió la arquitectura separando la Capa de Idea (los 5 niveles de investigación científica, autores y matrices) de la Capa Técnica (Python, .venv, Flask, Jinja2, CSS, Git, Render). Esto permite cambiar el dominio de negocio sin reescribir la base de software.</w:t>
-      </w:r>
-    </w:p>
-    <w:p>
-      <w:pPr>
-        <w:pStyle w:val="Heading2"/>
-        <w:spacing w:before="280" w:after="120"/>
-      </w:pPr>
-      <w:r>
-        <w:rPr>
-          <w:b/>
-          <w:color w:val="06B6D4"/>
-          <w:sz w:val="26"/>
-        </w:rPr>
-        <w:t>Paso 2: Entorno Virtual y Control de Dependencias</w:t>
-      </w:r>
-    </w:p>
-    <w:p>
-      <w:pPr>
-        <w:spacing w:after="120"/>
-      </w:pPr>
-      <w:r>
-        <w:t>Se creó el entorno virtual .venv para aislar paquetes y el archivo .gitignore. En requirements.txt se declararon Flask==3.0.3, Jinja2==3.1.4, Werkzeug==3.0.3 y gunicorn==21.2.0.</w:t>
-      </w:r>
-    </w:p>
-    <w:p>
-      <w:pPr>
-        <w:pStyle w:val="Heading2"/>
-        <w:spacing w:before="280" w:after="120"/>
-      </w:pPr>
-      <w:r>
-        <w:rPr>
-          <w:b/>
-          <w:color w:val="06B6D4"/>
-          <w:sz w:val="26"/>
-        </w:rPr>
-        <w:t>Paso 3: Modelado de Datos Pedagógicos y Epistemológicos</w:t>
-      </w:r>
-    </w:p>
-    <w:p>
-      <w:pPr>
-        <w:spacing w:after="120"/>
-      </w:pPr>
-      <w:r>
-        <w:t>Se crearon los módulos puros de Python en app/data/: levels_data.py con el desglose teórico de los 5 niveles y cuestionarios de autoevaluación; books_data.py con el catálogo de libros clásicos (Bunge, Popper, Sampieri, Kerlinger, Creswell, Arias, Kuhn); y pipeline_data.py con el estándar Archify.</w:t>
-      </w:r>
-    </w:p>
-    <w:p>
-      <w:pPr>
-        <w:pStyle w:val="Heading2"/>
-        <w:spacing w:before="280" w:after="120"/>
-      </w:pPr>
-      <w:r>
-        <w:rPr>
-          <w:b/>
-          <w:color w:val="06B6D4"/>
-          <w:sz w:val="26"/>
-        </w:rPr>
-        <w:t>Paso 4: Construcción de la Aplicación Flask Modular</w:t>
-      </w:r>
-    </w:p>
-    <w:p>
-      <w:pPr>
-        <w:spacing w:after="120"/>
-      </w:pPr>
-      <w:r>
-        <w:t>Se implementó el patrón Application Factory en app/__init__.py, controladores y rutas en app/routes.py, plantillas Jinja2 en app/templates/ y una hoja de estilos moderna (app/static/css/style.css) con modo oscuro y tarjetas glassmorphism.</w:t>
-      </w:r>
-    </w:p>
-    <w:p>
-      <w:pPr>
-        <w:pStyle w:val="Heading2"/>
-        <w:spacing w:before="280" w:after="120"/>
-      </w:pPr>
-      <w:r>
-        <w:rPr>
-          <w:b/>
-          <w:color w:val="06B6D4"/>
-          <w:sz w:val="26"/>
-        </w:rPr>
-        <w:t>Paso 5: Arte Vectorial de Alta Fidelidad</w:t>
-      </w:r>
-    </w:p>
-    <w:p>
-      <w:pPr>
-        <w:spacing w:after="120"/>
-      </w:pPr>
-      <w:r>
-        <w:t>Se integraron tres ilustraciones vectoriales de nivel profesional: hero_scientific_vector.png en la Landing Page, pipeline_archify_art.png en la vista de Pipeline y matrix_consistency_art.png en el generador de matrices.</w:t>
-      </w:r>
-    </w:p>
-    <w:p>
-      <w:pPr>
-        <w:pStyle w:val="Heading2"/>
-        <w:spacing w:before="280" w:after="120"/>
-      </w:pPr>
-      <w:r>
-        <w:rPr>
-          <w:b/>
-          <w:color w:val="06B6D4"/>
-          <w:sz w:val="26"/>
-        </w:rPr>
-        <w:t>Paso 6: Landing Page Raíz y Documentación Flask Especializada</w:t>
-      </w:r>
-    </w:p>
-    <w:p>
-      <w:pPr>
-        <w:spacing w:after="120"/>
-      </w:pPr>
-      <w:r>
-        <w:t>Se generó index.html en la raíz para GitHub Pages, se instaló la skill de documentación .agents/skills/flask-docs-architect/ y se estructuró la carpeta docs/documentacion/ con 6 manuales detallados de buenas prácticas.</w:t>
-      </w:r>
-    </w:p>
-    <w:p>
-      <w:pPr>
-        <w:pStyle w:val="Heading2"/>
-        <w:spacing w:before="280" w:after="120"/>
-      </w:pPr>
-      <w:r>
-        <w:rPr>
-          <w:b/>
-          <w:color w:val="06B6D4"/>
-          <w:sz w:val="26"/>
-        </w:rPr>
-        <w:t>Paso 7: Despliegue Automatizado en la Nube con Render</w:t>
-      </w:r>
-    </w:p>
-    <w:p>
-      <w:pPr>
-        <w:spacing w:after="120"/>
-      </w:pPr>
-      <w:r>
-        <w:t>Se creó el archivo Procfile (web: gunicorn app:app) y, mediante la API de Render y la API Key del usuario, se automatizó la creación del servicio web conectado al repositorio de GitHub, logrando el despliegue con estado live y HTTPS activo en https://investigalab-python.onrender.com.</w:t>
-      </w:r>
-    </w:p>
-    <w:p>
-      <w:pPr>
-        <w:pStyle w:val="Heading2"/>
-        <w:spacing w:before="280" w:after="120"/>
-      </w:pPr>
-      <w:r>
-        <w:rPr>
-          <w:b/>
-          <w:color w:val="06B6D4"/>
-          <w:sz w:val="26"/>
-        </w:rPr>
-        <w:t>Paso 8: Cuaderno Jupyter y Materiales de Sustentación</w:t>
-      </w:r>
-    </w:p>
-    <w:p>
-      <w:pPr>
-        <w:spacing w:after="120"/>
-      </w:pPr>
-      <w:r>
-        <w:t>Se generó el cuaderno interactivo InvestigaLab_Metodologia_Cientifica.ipynb para simular el cálculo muestral, Alfa de Cronbach y tamaño del efecto d de Cohen.</w:t>
-      </w:r>
-    </w:p>
-    <w:p>
-      <w:pPr>
-        <w:pStyle w:val="Heading1"/>
-        <w:spacing w:before="280" w:after="120"/>
-      </w:pPr>
-      <w:r>
-        <w:rPr>
-          <w:b/>
-          <w:color w:val="4F46E5"/>
-          <w:sz w:val="32"/>
-        </w:rPr>
-        <w:t>4. Estructura de Archivos del Proyecto</w:t>
-      </w:r>
-    </w:p>
-    <w:p>
-      <w:pPr>
-        <w:spacing w:after="280"/>
-      </w:pPr>
-      <w:r>
-        <w:rPr>
-          <w:rFonts w:ascii="Consolas" w:hAnsi="Consolas"/>
-          <w:sz w:val="17"/>
-        </w:rPr>
-        <w:t>PYTHON/CURSOR/</w:t>
-        <w:br/>
-        <w:t>├── index.html                      # Landing Page raíz para GitHub Pages y navegación directa</w:t>
-        <w:br/>
-        <w:t>├── run.py                          # Punto de entrada para el servidor Flask</w:t>
-        <w:br/>
-        <w:t>├── requirements.txt                # Dependencias de Python (Flask, Jinja2, gunicorn, etc.)</w:t>
-        <w:br/>
-        <w:t>├── Procfile                        # Comando de ejecución para Render (web: gunicorn app:app)</w:t>
-        <w:br/>
-        <w:t>├── InvestigaLab_Metodologia_Cientifica.ipynb # Cuaderno Jupyter con fórmulas estadísticas</w:t>
-        <w:br/>
-        <w:t>├── README.md                       # Documentación principal con badges y enlaces oficiales</w:t>
-        <w:br/>
-        <w:t>├── .gitignore                      # Exclusiones de Git (.venv, temporales)</w:t>
-        <w:br/>
-        <w:t>├── .agents/skills/flask-docs-architect/ # Skill de documentación de arquitectura Flask</w:t>
-        <w:br/>
-        <w:t>├── app/</w:t>
-        <w:br/>
-        <w:t>│   ├── __init__.py                 # Factoría de la aplicación Flask</w:t>
-        <w:br/>
-        <w:t>│   ├── routes.py                   # Controladores y rutas web</w:t>
-        <w:br/>
-        <w:t>│   ├── data/                       # Repositorio desacoplado de datos (Capa de Dominio)</w:t>
-        <w:br/>
-        <w:t>│   │   ├── levels_data.py          # Currículo de 5 niveles y cuestionarios</w:t>
-        <w:br/>
-        <w:t>│   │   ├── books_data.py           # Libros canónicos de metodología científica</w:t>
-        <w:br/>
-        <w:t>│   │   └── pipeline_data.py        # Datos de arquitectura y pipeline Archify</w:t>
-        <w:br/>
-        <w:t>│   ├── static/                     # CSS, JavaScript e imágenes vectoriales</w:t>
-        <w:br/>
-        <w:t>│   └── templates/                  # Plantillas Jinja2 (base, index, levels, books, pipeline, matriz)</w:t>
-        <w:br/>
-        <w:t>└── docs/</w:t>
-        <w:br/>
-        <w:t xml:space="preserve">    ├── tutorial.md                 # Guía paso a paso para principiantes</w:t>
-        <w:br/>
-        <w:t xml:space="preserve">    ├── arquitectura.md             # Documentación técnica de arquitectura</w:t>
-        <w:br/>
-        <w:t xml:space="preserve">    ├── presentacion_sustentacion.md # Guión del video de sustentación</w:t>
-        <w:br/>
-        <w:t xml:space="preserve">    ├── Documento_Entrega_y_Sustentacion_InvestigaLab.docx # Documento Word oficial</w:t>
-        <w:br/>
-        <w:t xml:space="preserve">    └── documentacion/              # 6 manuales de buenas prácticas con Flask</w:t>
-        <w:br/>
+        <w:t>Cada nivel cuenta con plantillas, fichas de fórmulas y checklists interactivos copiables con un solo clic, además de un Cuestionario Formativo de autoevaluación con feedback inmediato y un Generador de Matriz de Consistencia Metodológica en tiempo real.</w:t>
       </w:r>
     </w:p>
     <w:sectPr>
       <w:pgSz w:w="12240" w:h="15840"/>
-      <w:pgMar w:top="1440" w:right="1440" w:bottom="1440" w:left="1440" w:header="720" w:footer="720" w:gutter="0"/>
+      <w:pgMar w:top="1440" w:right="1800" w:bottom="1440" w:left="1800" w:header="720" w:footer="720" w:gutter="0"/>
       <w:cols w:space="720"/>
       <w:docGrid w:linePitch="360"/>
     </w:sectPr>

</xml_diff>